<commit_message>
add pdf and final edits
</commit_message>
<xml_diff>
--- a/Отчет.docx
+++ b/Отчет.docx
@@ -691,6 +691,28 @@
                 <w:lang w:eastAsia="zh-CN"/>
               </w:rPr>
             </w:pPr>
+            <w:proofErr w:type="spellStart"/>
+            <w:r>
+              <w:rPr>
+                <w:rFonts w:ascii="Times New Roman" w:eastAsia="Times New Roman" w:hAnsi="Times New Roman" w:cs="Times New Roman"/>
+                <w:b/>
+                <w:sz w:val="24"/>
+                <w:szCs w:val="24"/>
+                <w:lang w:eastAsia="zh-CN"/>
+              </w:rPr>
+              <w:t>Лашенков</w:t>
+            </w:r>
+            <w:proofErr w:type="spellEnd"/>
+            <w:r>
+              <w:rPr>
+                <w:rFonts w:ascii="Times New Roman" w:eastAsia="Times New Roman" w:hAnsi="Times New Roman" w:cs="Times New Roman"/>
+                <w:b/>
+                <w:sz w:val="24"/>
+                <w:szCs w:val="24"/>
+                <w:lang w:eastAsia="zh-CN"/>
+              </w:rPr>
+              <w:t xml:space="preserve"> Денис Игоревич</w:t>
+            </w:r>
           </w:p>
         </w:tc>
       </w:tr>
@@ -760,6 +782,30 @@
                 <w:lang w:eastAsia="zh-CN"/>
               </w:rPr>
             </w:pPr>
+            <w:r>
+              <w:rPr>
+                <w:rFonts w:ascii="Times New Roman" w:eastAsia="Times New Roman" w:hAnsi="Times New Roman" w:cs="Times New Roman"/>
+                <w:b/>
+                <w:i/>
+                <w:sz w:val="24"/>
+                <w:szCs w:val="24"/>
+                <w:lang w:eastAsia="zh-CN"/>
+              </w:rPr>
+              <w:t xml:space="preserve">Ассистент кафедры </w:t>
+            </w:r>
+            <w:proofErr w:type="spellStart"/>
+            <w:r>
+              <w:rPr>
+                <w:rFonts w:ascii="Times New Roman" w:eastAsia="Times New Roman" w:hAnsi="Times New Roman" w:cs="Times New Roman"/>
+                <w:b/>
+                <w:i/>
+                <w:sz w:val="24"/>
+                <w:szCs w:val="24"/>
+                <w:lang w:eastAsia="zh-CN"/>
+              </w:rPr>
+              <w:t>МиИ</w:t>
+            </w:r>
+            <w:proofErr w:type="spellEnd"/>
           </w:p>
         </w:tc>
       </w:tr>
@@ -939,39 +985,8 @@
         <w:tc>
           <w:tcPr>
             <w:tcW w:w="4783" w:type="dxa"/>
-          </w:tcPr>
-          <w:p>
-            <w:pPr>
-              <w:suppressAutoHyphens/>
-              <w:spacing w:after="0" w:line="240" w:lineRule="auto"/>
-              <w:rPr>
-                <w:rFonts w:ascii="Times New Roman" w:eastAsia="Times New Roman" w:hAnsi="Times New Roman" w:cs="Times New Roman"/>
-                <w:sz w:val="24"/>
-                <w:szCs w:val="24"/>
-                <w:lang w:eastAsia="zh-CN"/>
-              </w:rPr>
-            </w:pPr>
-            <w:r>
-              <w:rPr>
-                <w:rFonts w:ascii="Times New Roman" w:eastAsia="Times New Roman" w:hAnsi="Times New Roman" w:cs="Times New Roman"/>
-                <w:sz w:val="24"/>
-                <w:szCs w:val="24"/>
-                <w:lang w:eastAsia="zh-CN"/>
-              </w:rPr>
-              <w:t xml:space="preserve">Заключение о допуске к защите </w:t>
-            </w:r>
-          </w:p>
-        </w:tc>
-      </w:tr>
-      <w:tr>
-        <w:trPr>
-          <w:cantSplit/>
-        </w:trPr>
-        <w:tc>
-          <w:tcPr>
-            <w:tcW w:w="4783" w:type="dxa"/>
             <w:tcBorders>
-              <w:bottom w:val="single" w:sz="4" w:space="0" w:color="000000"/>
+              <w:top w:val="single" w:sz="4" w:space="0" w:color="000000"/>
             </w:tcBorders>
           </w:tcPr>
           <w:p>
@@ -987,19 +1002,6 @@
               </w:rPr>
             </w:pPr>
           </w:p>
-        </w:tc>
-      </w:tr>
-      <w:tr>
-        <w:trPr>
-          <w:cantSplit/>
-        </w:trPr>
-        <w:tc>
-          <w:tcPr>
-            <w:tcW w:w="4783" w:type="dxa"/>
-            <w:tcBorders>
-              <w:bottom w:val="single" w:sz="4" w:space="0" w:color="000000"/>
-            </w:tcBorders>
-          </w:tcPr>
           <w:p>
             <w:pPr>
               <w:suppressAutoHyphens/>
@@ -1013,19 +1015,21 @@
               </w:rPr>
             </w:pPr>
           </w:p>
-        </w:tc>
-      </w:tr>
-      <w:tr>
-        <w:trPr>
-          <w:cantSplit/>
-        </w:trPr>
-        <w:tc>
-          <w:tcPr>
-            <w:tcW w:w="4783" w:type="dxa"/>
-            <w:tcBorders>
-              <w:bottom w:val="single" w:sz="4" w:space="0" w:color="000000"/>
-            </w:tcBorders>
-          </w:tcPr>
+          <w:p>
+            <w:pPr>
+              <w:suppressAutoHyphens/>
+              <w:snapToGrid w:val="0"/>
+              <w:spacing w:after="0" w:line="240" w:lineRule="auto"/>
+              <w:rPr>
+                <w:rFonts w:ascii="Times New Roman" w:eastAsia="Times New Roman" w:hAnsi="Times New Roman" w:cs="Times New Roman"/>
+                <w:sz w:val="24"/>
+                <w:szCs w:val="24"/>
+                <w:lang w:eastAsia="zh-CN"/>
+              </w:rPr>
+            </w:pPr>
+            <w:bookmarkStart w:id="1" w:name="_GoBack"/>
+            <w:bookmarkEnd w:id="1"/>
+          </w:p>
           <w:p>
             <w:pPr>
               <w:suppressAutoHyphens/>
@@ -1039,19 +1043,6 @@
               </w:rPr>
             </w:pPr>
           </w:p>
-        </w:tc>
-      </w:tr>
-      <w:tr>
-        <w:trPr>
-          <w:cantSplit/>
-        </w:trPr>
-        <w:tc>
-          <w:tcPr>
-            <w:tcW w:w="4783" w:type="dxa"/>
-            <w:tcBorders>
-              <w:top w:val="single" w:sz="4" w:space="0" w:color="000000"/>
-            </w:tcBorders>
-          </w:tcPr>
           <w:p>
             <w:pPr>
               <w:suppressAutoHyphens/>
@@ -1376,6 +1367,13 @@
     </w:p>
     <w:sdt>
       <w:sdtPr>
+        <w:rPr>
+          <w:rFonts w:asciiTheme="minorHAnsi" w:eastAsiaTheme="minorHAnsi" w:hAnsiTheme="minorHAnsi" w:cstheme="minorBidi"/>
+          <w:color w:val="auto"/>
+          <w:sz w:val="22"/>
+          <w:szCs w:val="22"/>
+          <w:lang w:eastAsia="en-US"/>
+        </w:rPr>
         <w:id w:val="-922480709"/>
         <w:docPartObj>
           <w:docPartGallery w:val="Table of Contents"/>
@@ -1384,13 +1382,8 @@
       </w:sdtPr>
       <w:sdtEndPr>
         <w:rPr>
-          <w:rFonts w:asciiTheme="minorHAnsi" w:eastAsiaTheme="minorHAnsi" w:hAnsiTheme="minorHAnsi" w:cstheme="minorBidi"/>
           <w:b/>
           <w:bCs/>
-          <w:color w:val="auto"/>
-          <w:sz w:val="22"/>
-          <w:szCs w:val="22"/>
-          <w:lang w:eastAsia="en-US"/>
         </w:rPr>
       </w:sdtEndPr>
       <w:sdtContent>
@@ -3811,8 +3804,6 @@
         </w:rPr>
         <w:br w:type="page"/>
       </w:r>
-      <w:bookmarkStart w:id="1" w:name="_GoBack"/>
-      <w:bookmarkEnd w:id="1"/>
     </w:p>
     <w:p>
       <w:pPr>
@@ -4450,8 +4441,8 @@
           <w:lang w:val="ru-RU"/>
         </w:rPr>
       </w:pPr>
-      <w:bookmarkStart w:id="4" w:name="задание-1-первый-сеанс-rstudio."/>
-      <w:bookmarkStart w:id="5" w:name="_Toc200549236"/>
+      <w:bookmarkStart w:id="4" w:name="_Toc200549236"/>
+      <w:bookmarkStart w:id="5" w:name="задание-1-первый-сеанс-rstudio."/>
       <w:r>
         <w:rPr>
           <w:rFonts w:cs="Times New Roman"/>
@@ -4503,7 +4494,7 @@
         </w:rPr>
         <w:t>.</w:t>
       </w:r>
-      <w:bookmarkEnd w:id="5"/>
+      <w:bookmarkEnd w:id="4"/>
     </w:p>
     <w:p>
       <w:pPr>
@@ -6437,9 +6428,9 @@
           <w:lang w:val="ru-RU"/>
         </w:rPr>
       </w:pPr>
-      <w:bookmarkStart w:id="6" w:name="задание-2-работа-с-функциями-в-языке-r."/>
-      <w:bookmarkStart w:id="7" w:name="_Toc200549237"/>
-      <w:bookmarkEnd w:id="4"/>
+      <w:bookmarkStart w:id="6" w:name="_Toc200549237"/>
+      <w:bookmarkStart w:id="7" w:name="задание-2-работа-с-функциями-в-языке-r."/>
+      <w:bookmarkEnd w:id="5"/>
       <w:r>
         <w:rPr>
           <w:rFonts w:cs="Times New Roman"/>
@@ -6490,7 +6481,7 @@
         </w:rPr>
         <w:t>.</w:t>
       </w:r>
-      <w:bookmarkEnd w:id="7"/>
+      <w:bookmarkEnd w:id="6"/>
     </w:p>
     <w:p>
       <w:pPr>
@@ -8604,7 +8595,25 @@
           <w:sz w:val="28"/>
           <w:szCs w:val="28"/>
         </w:rPr>
-        <w:t xml:space="preserve"> записывается как: if (условие) </w:t>
+        <w:t xml:space="preserve"> записывается как: </w:t>
+      </w:r>
+      <w:proofErr w:type="spellStart"/>
+      <w:r>
+        <w:rPr>
+          <w:rFonts w:ascii="Times New Roman" w:hAnsi="Times New Roman" w:cs="Times New Roman"/>
+          <w:sz w:val="28"/>
+          <w:szCs w:val="28"/>
+        </w:rPr>
+        <w:t>if</w:t>
+      </w:r>
+      <w:proofErr w:type="spellEnd"/>
+      <w:r>
+        <w:rPr>
+          <w:rFonts w:ascii="Times New Roman" w:hAnsi="Times New Roman" w:cs="Times New Roman"/>
+          <w:sz w:val="28"/>
+          <w:szCs w:val="28"/>
+        </w:rPr>
+        <w:t xml:space="preserve"> (условие) </w:t>
       </w:r>
       <w:proofErr w:type="gramStart"/>
       <w:r>
@@ -8691,25 +8700,43 @@
           <w:sz w:val="28"/>
           <w:szCs w:val="28"/>
         </w:rPr>
-        <w:t xml:space="preserve"> записывается как: for (</w:t>
-      </w:r>
-      <w:proofErr w:type="spellStart"/>
-      <w:r>
-        <w:rPr>
-          <w:rFonts w:ascii="Times New Roman" w:hAnsi="Times New Roman" w:cs="Times New Roman"/>
-          <w:sz w:val="28"/>
-          <w:szCs w:val="28"/>
-        </w:rPr>
-        <w:t>i</w:t>
-      </w:r>
-      <w:proofErr w:type="spellEnd"/>
-      <w:r>
-        <w:rPr>
-          <w:rFonts w:ascii="Times New Roman" w:hAnsi="Times New Roman" w:cs="Times New Roman"/>
-          <w:sz w:val="28"/>
-          <w:szCs w:val="28"/>
-        </w:rPr>
-        <w:t xml:space="preserve"> in 1:10) </w:t>
+        <w:t xml:space="preserve"> записывается как: </w:t>
+      </w:r>
+      <w:proofErr w:type="spellStart"/>
+      <w:r>
+        <w:rPr>
+          <w:rFonts w:ascii="Times New Roman" w:hAnsi="Times New Roman" w:cs="Times New Roman"/>
+          <w:sz w:val="28"/>
+          <w:szCs w:val="28"/>
+        </w:rPr>
+        <w:t>for</w:t>
+      </w:r>
+      <w:proofErr w:type="spellEnd"/>
+      <w:r>
+        <w:rPr>
+          <w:rFonts w:ascii="Times New Roman" w:hAnsi="Times New Roman" w:cs="Times New Roman"/>
+          <w:sz w:val="28"/>
+          <w:szCs w:val="28"/>
+        </w:rPr>
+        <w:t xml:space="preserve"> (i </w:t>
+      </w:r>
+      <w:proofErr w:type="spellStart"/>
+      <w:r>
+        <w:rPr>
+          <w:rFonts w:ascii="Times New Roman" w:hAnsi="Times New Roman" w:cs="Times New Roman"/>
+          <w:sz w:val="28"/>
+          <w:szCs w:val="28"/>
+        </w:rPr>
+        <w:t>in</w:t>
+      </w:r>
+      <w:proofErr w:type="spellEnd"/>
+      <w:r>
+        <w:rPr>
+          <w:rFonts w:ascii="Times New Roman" w:hAnsi="Times New Roman" w:cs="Times New Roman"/>
+          <w:sz w:val="28"/>
+          <w:szCs w:val="28"/>
+        </w:rPr>
+        <w:t xml:space="preserve"> 1:10) </w:t>
       </w:r>
       <w:proofErr w:type="gramStart"/>
       <w:r>
@@ -8903,6 +8930,7 @@
         </w:rPr>
         <w:t xml:space="preserve">Значения по умолчанию для аргументов функции определяются с помощью знака = в определении функции, например: </w:t>
       </w:r>
+      <w:proofErr w:type="spellStart"/>
       <w:proofErr w:type="gramStart"/>
       <w:r>
         <w:rPr>
@@ -8910,9 +8938,17 @@
           <w:sz w:val="28"/>
           <w:szCs w:val="28"/>
         </w:rPr>
-        <w:t>function(</w:t>
-      </w:r>
-      <w:proofErr w:type="spellStart"/>
+        <w:t>function</w:t>
+      </w:r>
+      <w:proofErr w:type="spellEnd"/>
+      <w:r>
+        <w:rPr>
+          <w:rFonts w:ascii="Times New Roman" w:hAnsi="Times New Roman" w:cs="Times New Roman"/>
+          <w:sz w:val="28"/>
+          <w:szCs w:val="28"/>
+        </w:rPr>
+        <w:t>(</w:t>
+      </w:r>
       <w:proofErr w:type="gramEnd"/>
       <w:r>
         <w:rPr>
@@ -8920,16 +8956,7 @@
           <w:sz w:val="28"/>
           <w:szCs w:val="28"/>
         </w:rPr>
-        <w:t>arg</w:t>
-      </w:r>
-      <w:proofErr w:type="spellEnd"/>
-      <w:r>
-        <w:rPr>
-          <w:rFonts w:ascii="Times New Roman" w:hAnsi="Times New Roman" w:cs="Times New Roman"/>
-          <w:sz w:val="28"/>
-          <w:szCs w:val="28"/>
-        </w:rPr>
-        <w:t>1 = значение)</w:t>
+        <w:t>arg1 = значение)</w:t>
       </w:r>
     </w:p>
     <w:p>
@@ -9018,9 +9045,9 @@
           <w:lang w:val="ru-RU"/>
         </w:rPr>
       </w:pPr>
-      <w:bookmarkStart w:id="8" w:name="задание-3.-структуры-данных-в-r."/>
-      <w:bookmarkStart w:id="9" w:name="_Toc200549238"/>
-      <w:bookmarkEnd w:id="6"/>
+      <w:bookmarkStart w:id="8" w:name="_Toc200549238"/>
+      <w:bookmarkStart w:id="9" w:name="задание-3.-структуры-данных-в-r."/>
+      <w:bookmarkEnd w:id="7"/>
       <w:r>
         <w:rPr>
           <w:rFonts w:cs="Times New Roman"/>
@@ -9050,7 +9077,7 @@
         </w:rPr>
         <w:t>.</w:t>
       </w:r>
-      <w:bookmarkEnd w:id="9"/>
+      <w:bookmarkEnd w:id="8"/>
     </w:p>
     <w:p>
       <w:pPr>
@@ -11068,9 +11095,9 @@
           <w:lang w:val="ru-RU"/>
         </w:rPr>
       </w:pPr>
-      <w:bookmarkStart w:id="10" w:name="задание-4.-управление-данными-в-r."/>
-      <w:bookmarkStart w:id="11" w:name="_Toc200549239"/>
-      <w:bookmarkEnd w:id="8"/>
+      <w:bookmarkStart w:id="10" w:name="_Toc200549239"/>
+      <w:bookmarkStart w:id="11" w:name="задание-4.-управление-данными-в-r."/>
+      <w:bookmarkEnd w:id="9"/>
       <w:r>
         <w:rPr>
           <w:rFonts w:cs="Times New Roman"/>
@@ -11100,7 +11127,7 @@
         </w:rPr>
         <w:t>.</w:t>
       </w:r>
-      <w:bookmarkEnd w:id="11"/>
+      <w:bookmarkEnd w:id="10"/>
     </w:p>
     <w:p>
       <w:pPr>
@@ -14242,7 +14269,7 @@
         <w:t>##    4867   27200   36385   44261   55125  151479</w:t>
       </w:r>
       <w:bookmarkStart w:id="12" w:name="задание-5.-визуализация-данных-в-r."/>
-      <w:bookmarkEnd w:id="10"/>
+      <w:bookmarkEnd w:id="11"/>
     </w:p>
     <w:p>
       <w:pPr>
@@ -15080,31 +15107,7 @@
           <w:sz w:val="28"/>
           <w:szCs w:val="28"/>
         </w:rPr>
-        <w:t xml:space="preserve"> </w:t>
-      </w:r>
-      <w:r>
-        <w:rPr>
-          <w:rFonts w:ascii="Times New Roman" w:hAnsi="Times New Roman" w:cs="Times New Roman"/>
-          <w:sz w:val="28"/>
-          <w:szCs w:val="28"/>
-        </w:rPr>
-        <w:t>(</w:t>
-      </w:r>
-      <w:r>
-        <w:rPr>
-          <w:rFonts w:ascii="Times New Roman" w:hAnsi="Times New Roman" w:cs="Times New Roman"/>
-          <w:sz w:val="28"/>
-          <w:szCs w:val="28"/>
-        </w:rPr>
-        <w:t>См. рисунок 4 и рисунок 5</w:t>
-      </w:r>
-      <w:r>
-        <w:rPr>
-          <w:rFonts w:ascii="Times New Roman" w:hAnsi="Times New Roman" w:cs="Times New Roman"/>
-          <w:sz w:val="28"/>
-          <w:szCs w:val="28"/>
-        </w:rPr>
-        <w:t>)</w:t>
+        <w:t xml:space="preserve"> (См. рисунок 4 и рисунок 5)</w:t>
       </w:r>
       <w:r>
         <w:rPr>
@@ -17843,23 +17846,7 @@
           <w:sz w:val="28"/>
           <w:szCs w:val="28"/>
         </w:rPr>
-        <w:t>(</w:t>
-      </w:r>
-      <w:r>
-        <w:rPr>
-          <w:rFonts w:ascii="Times New Roman" w:hAnsi="Times New Roman" w:cs="Times New Roman"/>
-          <w:sz w:val="28"/>
-          <w:szCs w:val="28"/>
-        </w:rPr>
-        <w:t>См. рисунок 6</w:t>
-      </w:r>
-      <w:r>
-        <w:rPr>
-          <w:rFonts w:ascii="Times New Roman" w:hAnsi="Times New Roman" w:cs="Times New Roman"/>
-          <w:sz w:val="28"/>
-          <w:szCs w:val="28"/>
-        </w:rPr>
-        <w:t>)</w:t>
+        <w:t>(См. рисунок 6)</w:t>
       </w:r>
       <w:r>
         <w:rPr>
@@ -19827,8 +19814,8 @@
           <w:lang w:val="ru-RU"/>
         </w:rPr>
       </w:pPr>
-      <w:bookmarkStart w:id="15" w:name="Xffc3b689cc56a9fbeb1312bbceb25a613bb1b1d"/>
-      <w:bookmarkStart w:id="16" w:name="_Toc200549242"/>
+      <w:bookmarkStart w:id="15" w:name="_Toc200549242"/>
+      <w:bookmarkStart w:id="16" w:name="Xffc3b689cc56a9fbeb1312bbceb25a613bb1b1d"/>
       <w:r>
         <w:rPr>
           <w:rFonts w:cs="Times New Roman"/>
@@ -19849,7 +19836,7 @@
         </w:rPr>
         <w:t>.</w:t>
       </w:r>
-      <w:bookmarkEnd w:id="16"/>
+      <w:bookmarkEnd w:id="15"/>
     </w:p>
     <w:p>
       <w:pPr>
@@ -20362,9 +20349,9 @@
           <w:lang w:val="ru-RU"/>
         </w:rPr>
       </w:pPr>
-      <w:bookmarkStart w:id="18" w:name="описание-используемой-модели"/>
-      <w:bookmarkStart w:id="19" w:name="_Toc200549244"/>
-      <w:bookmarkEnd w:id="15"/>
+      <w:bookmarkStart w:id="18" w:name="_Toc200549244"/>
+      <w:bookmarkStart w:id="19" w:name="описание-используемой-модели"/>
+      <w:bookmarkEnd w:id="16"/>
       <w:r>
         <w:rPr>
           <w:rFonts w:cs="Times New Roman"/>
@@ -20376,7 +20363,7 @@
         <w:lastRenderedPageBreak/>
         <w:t>Описание используемой модели</w:t>
       </w:r>
-      <w:bookmarkEnd w:id="19"/>
+      <w:bookmarkEnd w:id="18"/>
     </w:p>
     <w:p>
       <w:pPr>
@@ -20510,9 +20497,9 @@
           <w:lang w:val="ru-RU"/>
         </w:rPr>
       </w:pPr>
-      <w:bookmarkStart w:id="20" w:name="описание-набора-данных"/>
-      <w:bookmarkStart w:id="21" w:name="_Toc200549245"/>
-      <w:bookmarkEnd w:id="18"/>
+      <w:bookmarkStart w:id="20" w:name="_Toc200549245"/>
+      <w:bookmarkStart w:id="21" w:name="описание-набора-данных"/>
+      <w:bookmarkEnd w:id="19"/>
       <w:r>
         <w:rPr>
           <w:rFonts w:cs="Times New Roman"/>
@@ -20523,7 +20510,7 @@
         </w:rPr>
         <w:t>Описание набора данных</w:t>
       </w:r>
-      <w:bookmarkEnd w:id="21"/>
+      <w:bookmarkEnd w:id="20"/>
     </w:p>
     <w:p>
       <w:pPr>
@@ -21219,26 +21206,32 @@
     <w:p>
       <w:pPr>
         <w:pStyle w:val="2"/>
-      </w:pPr>
-      <w:bookmarkStart w:id="23" w:name="разработка-модели"/>
-      <w:bookmarkStart w:id="24" w:name="_Toc200549247"/>
-      <w:bookmarkEnd w:id="20"/>
-      <w:r>
+        <w:rPr>
+          <w:lang w:val="ru-RU"/>
+        </w:rPr>
+      </w:pPr>
+      <w:bookmarkStart w:id="23" w:name="_Toc200549247"/>
+      <w:bookmarkStart w:id="24" w:name="разработка-модели"/>
+      <w:bookmarkEnd w:id="21"/>
+      <w:r>
+        <w:rPr>
+          <w:lang w:val="ru-RU"/>
+        </w:rPr>
         <w:t>Реализация решения</w:t>
       </w:r>
-      <w:bookmarkEnd w:id="24"/>
+      <w:bookmarkEnd w:id="23"/>
     </w:p>
     <w:p>
       <w:pPr>
         <w:pStyle w:val="3"/>
       </w:pPr>
-      <w:bookmarkStart w:id="25" w:name="подключение-необходимых-пакетов"/>
-      <w:bookmarkStart w:id="26" w:name="_Toc200549248"/>
-      <w:bookmarkEnd w:id="23"/>
+      <w:bookmarkStart w:id="25" w:name="_Toc200549248"/>
+      <w:bookmarkStart w:id="26" w:name="подключение-необходимых-пакетов"/>
+      <w:bookmarkEnd w:id="24"/>
       <w:r>
         <w:t>Подключение необходимых пакетов</w:t>
       </w:r>
-      <w:bookmarkEnd w:id="26"/>
+      <w:bookmarkEnd w:id="25"/>
     </w:p>
     <w:p>
       <w:pPr>
@@ -21435,12 +21428,12 @@
       <w:pPr>
         <w:pStyle w:val="3"/>
       </w:pPr>
-      <w:bookmarkStart w:id="27" w:name="чтение-и-предобработка-данных"/>
-      <w:bookmarkStart w:id="28" w:name="_Toc200549249"/>
+      <w:bookmarkStart w:id="27" w:name="_Toc200549249"/>
+      <w:bookmarkStart w:id="28" w:name="чтение-и-предобработка-данных"/>
       <w:r>
         <w:t>Чтение и предобработка данных</w:t>
       </w:r>
-      <w:bookmarkEnd w:id="28"/>
+      <w:bookmarkEnd w:id="27"/>
     </w:p>
     <w:p>
       <w:pPr>
@@ -25285,32 +25278,44 @@
     <w:p>
       <w:pPr>
         <w:pStyle w:val="3"/>
-      </w:pPr>
-      <w:bookmarkStart w:id="29" w:name="обучение-модели-и-предсказание-модели."/>
-      <w:bookmarkStart w:id="30" w:name="_Toc200549250"/>
-      <w:bookmarkEnd w:id="27"/>
+        <w:rPr>
+          <w:lang w:val="en-US"/>
+        </w:rPr>
+      </w:pPr>
+      <w:bookmarkStart w:id="29" w:name="_Toc200549250"/>
+      <w:bookmarkStart w:id="30" w:name="обучение-модели-и-предсказание-модели."/>
+      <w:bookmarkEnd w:id="28"/>
       <w:r>
         <w:t>Обучение</w:t>
       </w:r>
       <w:r>
+        <w:rPr>
+          <w:lang w:val="en-US"/>
+        </w:rPr>
         <w:t xml:space="preserve"> </w:t>
       </w:r>
       <w:r>
         <w:t>и</w:t>
       </w:r>
       <w:r>
+        <w:rPr>
+          <w:lang w:val="en-US"/>
+        </w:rPr>
         <w:t xml:space="preserve"> </w:t>
       </w:r>
       <w:r>
         <w:t>предсказание</w:t>
       </w:r>
       <w:r>
+        <w:rPr>
+          <w:lang w:val="en-US"/>
+        </w:rPr>
         <w:t xml:space="preserve"> </w:t>
       </w:r>
       <w:r>
         <w:t>модели</w:t>
       </w:r>
-      <w:bookmarkEnd w:id="30"/>
+      <w:bookmarkEnd w:id="29"/>
     </w:p>
     <w:p>
       <w:pPr>
@@ -25642,13 +25647,13 @@
       <w:pPr>
         <w:pStyle w:val="3"/>
       </w:pPr>
-      <w:bookmarkStart w:id="31" w:name="определение-порогового-значения"/>
-      <w:bookmarkStart w:id="32" w:name="_Toc200549251"/>
-      <w:bookmarkEnd w:id="29"/>
+      <w:bookmarkStart w:id="31" w:name="_Toc200549251"/>
+      <w:bookmarkStart w:id="32" w:name="определение-порогового-значения"/>
+      <w:bookmarkEnd w:id="30"/>
       <w:r>
         <w:t>Определение порогового значения</w:t>
       </w:r>
-      <w:bookmarkEnd w:id="32"/>
+      <w:bookmarkEnd w:id="31"/>
     </w:p>
     <w:p>
       <w:pPr>
@@ -25724,31 +25729,7 @@
           <w:sz w:val="28"/>
           <w:szCs w:val="28"/>
         </w:rPr>
-        <w:t xml:space="preserve"> </w:t>
-      </w:r>
-      <w:r>
-        <w:rPr>
-          <w:rFonts w:ascii="Times New Roman" w:hAnsi="Times New Roman" w:cs="Times New Roman"/>
-          <w:sz w:val="28"/>
-          <w:szCs w:val="28"/>
-        </w:rPr>
-        <w:t>(</w:t>
-      </w:r>
-      <w:r>
-        <w:rPr>
-          <w:rFonts w:ascii="Times New Roman" w:hAnsi="Times New Roman" w:cs="Times New Roman"/>
-          <w:sz w:val="28"/>
-          <w:szCs w:val="28"/>
-        </w:rPr>
-        <w:t>См. рисунок 8</w:t>
-      </w:r>
-      <w:r>
-        <w:rPr>
-          <w:rFonts w:ascii="Times New Roman" w:hAnsi="Times New Roman" w:cs="Times New Roman"/>
-          <w:sz w:val="28"/>
-          <w:szCs w:val="28"/>
-        </w:rPr>
-        <w:t>)</w:t>
+        <w:t xml:space="preserve"> (См. рисунок 8)</w:t>
       </w:r>
       <w:r>
         <w:rPr>
@@ -26439,31 +26420,7 @@
           <w:sz w:val="28"/>
           <w:szCs w:val="28"/>
         </w:rPr>
-        <w:t xml:space="preserve"> </w:t>
-      </w:r>
-      <w:r>
-        <w:rPr>
-          <w:rFonts w:ascii="Times New Roman" w:hAnsi="Times New Roman" w:cs="Times New Roman"/>
-          <w:sz w:val="28"/>
-          <w:szCs w:val="28"/>
-        </w:rPr>
-        <w:t>(</w:t>
-      </w:r>
-      <w:r>
-        <w:rPr>
-          <w:rFonts w:ascii="Times New Roman" w:hAnsi="Times New Roman" w:cs="Times New Roman"/>
-          <w:sz w:val="28"/>
-          <w:szCs w:val="28"/>
-        </w:rPr>
-        <w:t>См. рисунок 9</w:t>
-      </w:r>
-      <w:r>
-        <w:rPr>
-          <w:rFonts w:ascii="Times New Roman" w:hAnsi="Times New Roman" w:cs="Times New Roman"/>
-          <w:sz w:val="28"/>
-          <w:szCs w:val="28"/>
-        </w:rPr>
-        <w:t>)</w:t>
+        <w:t xml:space="preserve"> (См. рисунок 9)</w:t>
       </w:r>
       <w:r>
         <w:rPr>
@@ -27382,10 +27339,10 @@
       <w:pPr>
         <w:pStyle w:val="3"/>
       </w:pPr>
-      <w:bookmarkStart w:id="33" w:name="X3663878fef31d94537f5e18bd7d0a83e63aac2b"/>
-      <w:bookmarkStart w:id="34" w:name="_Toc200549252"/>
-      <w:bookmarkEnd w:id="25"/>
-      <w:bookmarkEnd w:id="31"/>
+      <w:bookmarkStart w:id="33" w:name="_Toc200549252"/>
+      <w:bookmarkStart w:id="34" w:name="X3663878fef31d94537f5e18bd7d0a83e63aac2b"/>
+      <w:bookmarkEnd w:id="26"/>
+      <w:bookmarkEnd w:id="32"/>
       <w:r>
         <w:t>Определение</w:t>
       </w:r>
@@ -27404,7 +27361,7 @@
       <w:r>
         <w:t xml:space="preserve"> с метками</w:t>
       </w:r>
-      <w:bookmarkEnd w:id="34"/>
+      <w:bookmarkEnd w:id="33"/>
     </w:p>
     <w:p>
       <w:pPr>
@@ -27649,17 +27606,53 @@
     <w:p>
       <w:pPr>
         <w:pStyle w:val="3"/>
-      </w:pPr>
-      <w:bookmarkStart w:id="35" w:name="X5efdb3fc0c686fe0967a2fa7a9afebdea4cb8e0"/>
-      <w:bookmarkStart w:id="36" w:name="_Toc200549253"/>
-      <w:bookmarkEnd w:id="33"/>
-      <w:r>
-        <w:t>Использование различных метрик</w:t>
-      </w:r>
-      <w:r>
-        <w:t xml:space="preserve"> точности модели</w:t>
-      </w:r>
-      <w:bookmarkEnd w:id="36"/>
+        <w:rPr>
+          <w:lang w:val="en-US"/>
+        </w:rPr>
+      </w:pPr>
+      <w:bookmarkStart w:id="35" w:name="_Toc200549253"/>
+      <w:bookmarkStart w:id="36" w:name="X5efdb3fc0c686fe0967a2fa7a9afebdea4cb8e0"/>
+      <w:bookmarkEnd w:id="34"/>
+      <w:r>
+        <w:t>Использование</w:t>
+      </w:r>
+      <w:r>
+        <w:rPr>
+          <w:lang w:val="en-US"/>
+        </w:rPr>
+        <w:t xml:space="preserve"> </w:t>
+      </w:r>
+      <w:r>
+        <w:t>различных</w:t>
+      </w:r>
+      <w:r>
+        <w:rPr>
+          <w:lang w:val="en-US"/>
+        </w:rPr>
+        <w:t xml:space="preserve"> </w:t>
+      </w:r>
+      <w:r>
+        <w:t>метрик</w:t>
+      </w:r>
+      <w:r>
+        <w:rPr>
+          <w:lang w:val="en-US"/>
+        </w:rPr>
+        <w:t xml:space="preserve"> </w:t>
+      </w:r>
+      <w:r>
+        <w:t>точности</w:t>
+      </w:r>
+      <w:r>
+        <w:rPr>
+          <w:lang w:val="en-US"/>
+        </w:rPr>
+        <w:t xml:space="preserve"> </w:t>
+      </w:r>
+      <w:r>
+        <w:t>модели</w:t>
+      </w:r>
+      <w:bookmarkEnd w:id="35"/>
     </w:p>
     <w:p>
       <w:pPr>
@@ -28631,13 +28624,13 @@
       <w:pPr>
         <w:pStyle w:val="3"/>
       </w:pPr>
-      <w:bookmarkStart w:id="37" w:name="сохранение-модели."/>
-      <w:bookmarkStart w:id="38" w:name="_Toc200549254"/>
-      <w:bookmarkEnd w:id="35"/>
+      <w:bookmarkStart w:id="37" w:name="_Toc200549254"/>
+      <w:bookmarkStart w:id="38" w:name="сохранение-модели."/>
+      <w:bookmarkEnd w:id="36"/>
       <w:r>
         <w:t>Сохранение модели</w:t>
       </w:r>
-      <w:bookmarkEnd w:id="38"/>
+      <w:bookmarkEnd w:id="37"/>
     </w:p>
     <w:p>
       <w:pPr>
@@ -28775,7 +28768,7 @@
         <w:t>)</w:t>
       </w:r>
     </w:p>
-    <w:bookmarkEnd w:id="37"/>
+    <w:bookmarkEnd w:id="38"/>
     <w:p>
       <w:pPr>
         <w:rPr>
@@ -28785,7 +28778,7 @@
           <w:kern w:val="2"/>
           <w:sz w:val="32"/>
           <w:szCs w:val="32"/>
-          <w:lang w:eastAsia="zh-CN"/>
+          <w:lang w:val="en-US" w:eastAsia="zh-CN"/>
         </w:rPr>
       </w:pPr>
       <w:r>
@@ -28794,7 +28787,7 @@
           <w:b/>
           <w:bCs/>
           <w:kern w:val="2"/>
-          <w:lang w:eastAsia="zh-CN"/>
+          <w:lang w:val="en-US" w:eastAsia="zh-CN"/>
         </w:rPr>
         <w:br w:type="page"/>
       </w:r>
@@ -33864,6 +33857,7 @@
   <w:style w:type="character" w:default="1" w:styleId="a1">
     <w:name w:val="Default Paragraph Font"/>
     <w:uiPriority w:val="1"/>
+    <w:semiHidden/>
     <w:unhideWhenUsed/>
   </w:style>
   <w:style w:type="table" w:default="1" w:styleId="a2">
@@ -34525,7 +34519,7 @@
 </file>
 
 <file path=customXml/itemProps1.xml><?xml version="1.0" encoding="utf-8"?>
-<ds:datastoreItem xmlns:ds="http://schemas.openxmlformats.org/officeDocument/2006/customXml" ds:itemID="{552187ED-2383-4E7A-8D00-FFF201B6D5F3}">
+<ds:datastoreItem xmlns:ds="http://schemas.openxmlformats.org/officeDocument/2006/customXml" ds:itemID="{47DBFCF4-DF17-42FB-92B5-34BB4F7AFB63}">
   <ds:schemaRefs>
     <ds:schemaRef ds:uri="http://schemas.openxmlformats.org/officeDocument/2006/bibliography"/>
   </ds:schemaRefs>

</xml_diff>